<commit_message>
docs: add roadmap and refresh the status documents
Add PLANS.md as the running roadmap for review 2 and beyond, covering
already-deferred work and ranked candidate research directions with
risk and confidence labels.

Refresh README.md, which still claimed checkout was excluded and
predated put(), delete(), log(), and the commit graph. Document both
engines and the new benchmark and demo entry points.

Update Chronos_Work_Completed.docx: new capability rows for incremental
writes, the commit graph, and time travel; the demonstration section
restated on the put() path; benchmark figures refreshed from a single
matched run; asset list and test counts brought current; and checkout
removed from the scope-boundary exclusions.
</commit_message>
<xml_diff>
--- a/output/docs/Chronos_Work_Completed.docx
+++ b/output/docs/Chronos_Work_Completed.docx
@@ -101,7 +101,7 @@
           <w:color w:val="000000"/>
           <w:sz w:val="20"/>
         </w:rPr>
-        <w:t xml:space="preserve">Status: </w:t>
+        <w:t>Status: Core proof of concept complete and tested, with incremental writes and a commit graph</w:t>
       </w:r>
       <w:r>
         <w:rPr>
@@ -109,7 +109,6 @@
           <w:color w:val="666666"/>
           <w:sz w:val="20"/>
         </w:rPr>
-        <w:t>Core proof of concept complete and tested</w:t>
       </w:r>
     </w:p>
     <w:p>
@@ -125,7 +124,7 @@
           <w:color w:val="1F4D78"/>
           <w:sz w:val="22"/>
         </w:rPr>
-        <w:t xml:space="preserve">Current outcome: </w:t>
+        <w:t>Current outcome: The required demonstration works end to end: commit version 1, change a few keys with put() without rebuilding the tree, commit further versions with messages, compare the roots, walk the commit history with log(), and check out any earlier version. Structural sharing and diff statistics are reported throughout.</w:t>
       </w:r>
       <w:r>
         <w:rPr>
@@ -133,7 +132,6 @@
           <w:color w:val="000000"/>
           <w:sz w:val="22"/>
         </w:rPr>
-        <w:t>The required demonstration works end to end: commit version 1, change a few keys, commit version 2, compare the roots, and report structural sharing and diff statistics.</w:t>
       </w:r>
     </w:p>
     <w:p>
@@ -494,7 +492,9 @@
               <w:spacing w:before="0" w:after="0" w:line="264" w:lineRule="auto"/>
               <w:jc w:val="left"/>
             </w:pPr>
-            <w:r/>
+            <w:r>
+              <w:t>commit(state, message)</w:t>
+            </w:r>
             <w:r>
               <w:rPr>
                 <w:rFonts w:ascii="Calibri" w:hAnsi="Calibri"/>
@@ -502,7 +502,6 @@
                 <w:color w:val="000000"/>
                 <w:sz w:val="18"/>
               </w:rPr>
-              <w:t>commit(state)</w:t>
             </w:r>
           </w:p>
         </w:tc>
@@ -765,6 +764,273 @@
           </w:p>
         </w:tc>
       </w:tr>
+      <w:tr>
+        <w:tc>
+          <w:tcPr>
+            <w:tcW w:type="dxa" w:w="1700"/>
+            <w:tcMar>
+              <w:top w:w="80" w:type="dxa"/>
+              <w:start w:w="120" w:type="dxa"/>
+              <w:bottom w:w="80" w:type="dxa"/>
+              <w:end w:w="120" w:type="dxa"/>
+            </w:tcMar>
+            <w:vAlign w:val="center"/>
+          </w:tcPr>
+          <w:p>
+            <w:pPr>
+              <w:spacing w:before="0" w:after="0" w:line="264" w:lineRule="auto"/>
+              <w:jc w:val="left"/>
+            </w:pPr>
+            <w:r>
+              <w:t>Incremental write</w:t>
+            </w:r>
+            <w:r>
+              <w:rPr>
+                <w:rFonts w:ascii="Calibri" w:hAnsi="Calibri"/>
+                <w:b w:val="0"/>
+                <w:color w:val="000000"/>
+                <w:sz w:val="18"/>
+              </w:rPr>
+            </w:r>
+          </w:p>
+        </w:tc>
+        <w:tc>
+          <w:tcPr>
+            <w:tcW w:type="dxa" w:w="5560"/>
+            <w:tcMar>
+              <w:top w:w="80" w:type="dxa"/>
+              <w:start w:w="120" w:type="dxa"/>
+              <w:bottom w:w="80" w:type="dxa"/>
+              <w:end w:w="120" w:type="dxa"/>
+            </w:tcMar>
+            <w:vAlign w:val="center"/>
+          </w:tcPr>
+          <w:p>
+            <w:pPr>
+              <w:spacing w:before="0" w:after="0" w:line="264" w:lineRule="auto"/>
+              <w:jc w:val="left"/>
+            </w:pPr>
+            <w:r>
+              <w:t>Sets or removes a single key by rewriting only the tree_depth + 1 nodes on its routed path; every sibling subtree is reused by hash without recomputation.</w:t>
+            </w:r>
+            <w:r>
+              <w:rPr>
+                <w:rFonts w:ascii="Calibri" w:hAnsi="Calibri"/>
+                <w:b w:val="0"/>
+                <w:color w:val="000000"/>
+                <w:sz w:val="18"/>
+              </w:rPr>
+            </w:r>
+          </w:p>
+        </w:tc>
+        <w:tc>
+          <w:tcPr>
+            <w:tcW w:type="dxa" w:w="2100"/>
+            <w:tcMar>
+              <w:top w:w="80" w:type="dxa"/>
+              <w:start w:w="120" w:type="dxa"/>
+              <w:bottom w:w="80" w:type="dxa"/>
+              <w:end w:w="120" w:type="dxa"/>
+            </w:tcMar>
+            <w:vAlign w:val="center"/>
+          </w:tcPr>
+          <w:p>
+            <w:pPr>
+              <w:spacing w:before="0" w:after="0" w:line="264" w:lineRule="auto"/>
+              <w:jc w:val="left"/>
+            </w:pPr>
+            <w:r>
+              <w:t>put(root, key, value) / delete(root, key)</w:t>
+            </w:r>
+            <w:r>
+              <w:rPr>
+                <w:rFonts w:ascii="Calibri" w:hAnsi="Calibri"/>
+                <w:b w:val="0"/>
+                <w:color w:val="000000"/>
+                <w:sz w:val="18"/>
+              </w:rPr>
+            </w:r>
+          </w:p>
+        </w:tc>
+      </w:tr>
+      <w:tr>
+        <w:tc>
+          <w:tcPr>
+            <w:tcW w:type="dxa" w:w="1700"/>
+            <w:tcMar>
+              <w:top w:w="80" w:type="dxa"/>
+              <w:start w:w="120" w:type="dxa"/>
+              <w:bottom w:w="80" w:type="dxa"/>
+              <w:end w:w="120" w:type="dxa"/>
+            </w:tcMar>
+            <w:vAlign w:val="center"/>
+          </w:tcPr>
+          <w:p>
+            <w:pPr>
+              <w:spacing w:before="0" w:after="0" w:line="264" w:lineRule="auto"/>
+              <w:jc w:val="left"/>
+            </w:pPr>
+            <w:r>
+              <w:t>Commit graph</w:t>
+            </w:r>
+            <w:r>
+              <w:rPr>
+                <w:rFonts w:ascii="Calibri" w:hAnsi="Calibri"/>
+                <w:b w:val="0"/>
+                <w:color w:val="000000"/>
+                <w:sz w:val="18"/>
+              </w:rPr>
+            </w:r>
+          </w:p>
+        </w:tc>
+        <w:tc>
+          <w:tcPr>
+            <w:tcW w:type="dxa" w:w="5560"/>
+            <w:tcMar>
+              <w:top w:w="80" w:type="dxa"/>
+              <w:start w:w="120" w:type="dxa"/>
+              <w:bottom w:w="80" w:type="dxa"/>
+              <w:end w:w="120" w:type="dxa"/>
+            </w:tcMar>
+            <w:vAlign w:val="center"/>
+          </w:tcPr>
+          <w:p>
+            <w:pPr>
+              <w:spacing w:before="0" w:after="0" w:line="264" w:lineRule="auto"/>
+              <w:jc w:val="left"/>
+            </w:pPr>
+            <w:r>
+              <w:t>Immutable commit objects carrying version, root hash, parent, message, and timestamp, with a tracked HEAD and parent-pointer history walk.</w:t>
+            </w:r>
+            <w:r>
+              <w:rPr>
+                <w:rFonts w:ascii="Calibri" w:hAnsi="Calibri"/>
+                <w:b w:val="0"/>
+                <w:color w:val="000000"/>
+                <w:sz w:val="18"/>
+              </w:rPr>
+            </w:r>
+          </w:p>
+        </w:tc>
+        <w:tc>
+          <w:tcPr>
+            <w:tcW w:type="dxa" w:w="2100"/>
+            <w:tcMar>
+              <w:top w:w="80" w:type="dxa"/>
+              <w:start w:w="120" w:type="dxa"/>
+              <w:bottom w:w="80" w:type="dxa"/>
+              <w:end w:w="120" w:type="dxa"/>
+            </w:tcMar>
+            <w:vAlign w:val="center"/>
+          </w:tcPr>
+          <w:p>
+            <w:pPr>
+              <w:spacing w:before="0" w:after="0" w:line="264" w:lineRule="auto"/>
+              <w:jc w:val="left"/>
+            </w:pPr>
+            <w:r>
+              <w:t>Commit / log() / head</w:t>
+            </w:r>
+            <w:r>
+              <w:rPr>
+                <w:rFonts w:ascii="Calibri" w:hAnsi="Calibri"/>
+                <w:b w:val="0"/>
+                <w:color w:val="000000"/>
+                <w:sz w:val="18"/>
+              </w:rPr>
+            </w:r>
+          </w:p>
+        </w:tc>
+      </w:tr>
+      <w:tr>
+        <w:tc>
+          <w:tcPr>
+            <w:tcW w:type="dxa" w:w="1700"/>
+            <w:tcMar>
+              <w:top w:w="80" w:type="dxa"/>
+              <w:start w:w="120" w:type="dxa"/>
+              <w:bottom w:w="80" w:type="dxa"/>
+              <w:end w:w="120" w:type="dxa"/>
+            </w:tcMar>
+            <w:vAlign w:val="center"/>
+          </w:tcPr>
+          <w:p>
+            <w:pPr>
+              <w:spacing w:before="0" w:after="0" w:line="264" w:lineRule="auto"/>
+              <w:jc w:val="left"/>
+            </w:pPr>
+            <w:r>
+              <w:t>Time travel</w:t>
+            </w:r>
+            <w:r>
+              <w:rPr>
+                <w:rFonts w:ascii="Calibri" w:hAnsi="Calibri"/>
+                <w:b w:val="0"/>
+                <w:color w:val="000000"/>
+                <w:sz w:val="18"/>
+              </w:rPr>
+            </w:r>
+          </w:p>
+        </w:tc>
+        <w:tc>
+          <w:tcPr>
+            <w:tcW w:type="dxa" w:w="5560"/>
+            <w:tcMar>
+              <w:top w:w="80" w:type="dxa"/>
+              <w:start w:w="120" w:type="dxa"/>
+              <w:bottom w:w="80" w:type="dxa"/>
+              <w:end w:w="120" w:type="dxa"/>
+            </w:tcMar>
+            <w:vAlign w:val="center"/>
+          </w:tcPr>
+          <w:p>
+            <w:pPr>
+              <w:spacing w:before="0" w:after="0" w:line="264" w:lineRule="auto"/>
+              <w:jc w:val="left"/>
+            </w:pPr>
+            <w:r>
+              <w:t>Rebuilds the complete state at any committed version from its root hash.</w:t>
+            </w:r>
+            <w:r>
+              <w:rPr>
+                <w:rFonts w:ascii="Calibri" w:hAnsi="Calibri"/>
+                <w:b w:val="0"/>
+                <w:color w:val="000000"/>
+                <w:sz w:val="18"/>
+              </w:rPr>
+            </w:r>
+          </w:p>
+        </w:tc>
+        <w:tc>
+          <w:tcPr>
+            <w:tcW w:type="dxa" w:w="2100"/>
+            <w:tcMar>
+              <w:top w:w="80" w:type="dxa"/>
+              <w:start w:w="120" w:type="dxa"/>
+              <w:bottom w:w="80" w:type="dxa"/>
+              <w:end w:w="120" w:type="dxa"/>
+            </w:tcMar>
+            <w:vAlign w:val="center"/>
+          </w:tcPr>
+          <w:p>
+            <w:pPr>
+              <w:spacing w:before="0" w:after="0" w:line="264" w:lineRule="auto"/>
+              <w:jc w:val="left"/>
+            </w:pPr>
+            <w:r>
+              <w:t>checkout(version) / materialize(root)</w:t>
+            </w:r>
+            <w:r>
+              <w:rPr>
+                <w:rFonts w:ascii="Calibri" w:hAnsi="Calibri"/>
+                <w:b w:val="0"/>
+                <w:color w:val="000000"/>
+                <w:sz w:val="18"/>
+              </w:rPr>
+            </w:r>
+          </w:p>
+        </w:tc>
+      </w:tr>
     </w:tbl>
     <w:p>
       <w:pPr>
@@ -792,7 +1058,7 @@
         <w:pStyle w:val="ListNumber"/>
       </w:pPr>
       <w:r>
-        <w:t>Change key-0010, key-0500, and key-0900.</w:t>
+        <w:t>Change key-0010, key-0500, and key-0900 using put(), one commit each, without rebuilding the tree.</w:t>
       </w:r>
     </w:p>
     <w:p>
@@ -800,7 +1066,7 @@
         <w:pStyle w:val="ListNumber"/>
       </w:pPr>
       <w:r>
-        <w:t>Commit the modified state as version 2 while reusing matching nodes.</w:t>
+        <w:t>Each put() creates its own version with a message and a parent pointer, reusing all matching nodes.</w:t>
       </w:r>
     </w:p>
     <w:p>
@@ -1047,7 +1313,9 @@
               <w:spacing w:before="0" w:after="0" w:line="264" w:lineRule="auto"/>
               <w:jc w:val="left"/>
             </w:pPr>
-            <w:r/>
+            <w:r>
+              <w:t>15 new nodes total</w:t>
+            </w:r>
             <w:r>
               <w:rPr>
                 <w:rFonts w:ascii="Calibri" w:hAnsi="Calibri"/>
@@ -1055,7 +1323,6 @@
                 <w:color w:val="000000"/>
                 <w:sz w:val="18"/>
               </w:rPr>
-              <w:t>12 new / 1,402 reused</w:t>
             </w:r>
           </w:p>
         </w:tc>
@@ -1075,7 +1342,9 @@
               <w:spacing w:before="0" w:after="0" w:line="264" w:lineRule="auto"/>
               <w:jc w:val="left"/>
             </w:pPr>
-            <w:r/>
+            <w:r>
+              <w:t>Three put() calls, five nodes each (tree_depth + 1)</w:t>
+            </w:r>
             <w:r>
               <w:rPr>
                 <w:rFonts w:ascii="Calibri" w:hAnsi="Calibri"/>
@@ -1083,7 +1352,6 @@
                 <w:color w:val="000000"/>
                 <w:sz w:val="18"/>
               </w:rPr>
-              <w:t>Only changed paths receive new hashes</w:t>
             </w:r>
           </w:p>
         </w:tc>
@@ -1133,7 +1401,9 @@
               <w:spacing w:before="0" w:after="0" w:line="264" w:lineRule="auto"/>
               <w:jc w:val="left"/>
             </w:pPr>
-            <w:r/>
+            <w:r>
+              <w:t>98.9%</w:t>
+            </w:r>
             <w:r>
               <w:rPr>
                 <w:rFonts w:ascii="Calibri" w:hAnsi="Calibri"/>
@@ -1141,7 +1411,6 @@
                 <w:color w:val="000000"/>
                 <w:sz w:val="18"/>
               </w:rPr>
-              <w:t>99.2%</w:t>
             </w:r>
           </w:p>
         </w:tc>
@@ -1161,7 +1430,9 @@
               <w:spacing w:before="0" w:after="0" w:line="264" w:lineRule="auto"/>
               <w:jc w:val="left"/>
             </w:pPr>
-            <w:r/>
+            <w:r>
+              <w:t>1,414 of 1,429 nodes were left untouched and shared</w:t>
+            </w:r>
             <w:r>
               <w:rPr>
                 <w:rFonts w:ascii="Calibri" w:hAnsi="Calibri"/>
@@ -1169,7 +1440,6 @@
                 <w:color w:val="000000"/>
                 <w:sz w:val="18"/>
               </w:rPr>
-              <w:t>Most of version 1 is referenced by version 2</w:t>
             </w:r>
           </w:p>
         </w:tc>
@@ -1342,6 +1612,184 @@
                 <w:sz w:val="18"/>
               </w:rPr>
               <w:t>Matching hashes prevented deeper traversal</w:t>
+            </w:r>
+          </w:p>
+        </w:tc>
+      </w:tr>
+      <w:tr>
+        <w:tc>
+          <w:tcPr>
+            <w:tcW w:type="dxa" w:w="2050"/>
+            <w:tcMar>
+              <w:top w:w="80" w:type="dxa"/>
+              <w:start w:w="120" w:type="dxa"/>
+              <w:bottom w:w="80" w:type="dxa"/>
+              <w:end w:w="120" w:type="dxa"/>
+            </w:tcMar>
+            <w:vAlign w:val="center"/>
+          </w:tcPr>
+          <w:p>
+            <w:pPr>
+              <w:spacing w:before="0" w:after="0" w:line="264" w:lineRule="auto"/>
+              <w:jc w:val="left"/>
+            </w:pPr>
+            <w:r>
+              <w:t>Root equivalence</w:t>
+            </w:r>
+            <w:r>
+              <w:rPr>
+                <w:rFonts w:ascii="Calibri" w:hAnsi="Calibri"/>
+                <w:b w:val="0"/>
+                <w:color w:val="000000"/>
+                <w:sz w:val="18"/>
+              </w:rPr>
+            </w:r>
+          </w:p>
+        </w:tc>
+        <w:tc>
+          <w:tcPr>
+            <w:tcW w:type="dxa" w:w="2160"/>
+            <w:tcMar>
+              <w:top w:w="80" w:type="dxa"/>
+              <w:start w:w="120" w:type="dxa"/>
+              <w:bottom w:w="80" w:type="dxa"/>
+              <w:end w:w="120" w:type="dxa"/>
+            </w:tcMar>
+            <w:vAlign w:val="center"/>
+          </w:tcPr>
+          <w:p>
+            <w:pPr>
+              <w:spacing w:before="0" w:after="0" w:line="264" w:lineRule="auto"/>
+              <w:jc w:val="left"/>
+            </w:pPr>
+            <w:r>
+              <w:t>Identical</w:t>
+            </w:r>
+            <w:r>
+              <w:rPr>
+                <w:rFonts w:ascii="Calibri" w:hAnsi="Calibri"/>
+                <w:b w:val="0"/>
+                <w:color w:val="000000"/>
+                <w:sz w:val="18"/>
+              </w:rPr>
+            </w:r>
+          </w:p>
+        </w:tc>
+        <w:tc>
+          <w:tcPr>
+            <w:tcW w:type="dxa" w:w="5150"/>
+            <w:tcMar>
+              <w:top w:w="80" w:type="dxa"/>
+              <w:start w:w="120" w:type="dxa"/>
+              <w:bottom w:w="80" w:type="dxa"/>
+              <w:end w:w="120" w:type="dxa"/>
+            </w:tcMar>
+            <w:vAlign w:val="center"/>
+          </w:tcPr>
+          <w:p>
+            <w:pPr>
+              <w:spacing w:before="0" w:after="0" w:line="264" w:lineRule="auto"/>
+              <w:jc w:val="left"/>
+            </w:pPr>
+            <w:r>
+              <w:t>The put() root hash matches a full rebuild of the same state</w:t>
+            </w:r>
+            <w:r>
+              <w:rPr>
+                <w:rFonts w:ascii="Calibri" w:hAnsi="Calibri"/>
+                <w:b w:val="0"/>
+                <w:color w:val="000000"/>
+                <w:sz w:val="18"/>
+              </w:rPr>
+            </w:r>
+          </w:p>
+        </w:tc>
+      </w:tr>
+      <w:tr>
+        <w:tc>
+          <w:tcPr>
+            <w:tcW w:type="dxa" w:w="2050"/>
+            <w:tcMar>
+              <w:top w:w="80" w:type="dxa"/>
+              <w:start w:w="120" w:type="dxa"/>
+              <w:bottom w:w="80" w:type="dxa"/>
+              <w:end w:w="120" w:type="dxa"/>
+            </w:tcMar>
+            <w:vAlign w:val="center"/>
+          </w:tcPr>
+          <w:p>
+            <w:pPr>
+              <w:spacing w:before="0" w:after="0" w:line="264" w:lineRule="auto"/>
+              <w:jc w:val="left"/>
+            </w:pPr>
+            <w:r>
+              <w:t>History</w:t>
+            </w:r>
+            <w:r>
+              <w:rPr>
+                <w:rFonts w:ascii="Calibri" w:hAnsi="Calibri"/>
+                <w:b w:val="0"/>
+                <w:color w:val="000000"/>
+                <w:sz w:val="18"/>
+              </w:rPr>
+            </w:r>
+          </w:p>
+        </w:tc>
+        <w:tc>
+          <w:tcPr>
+            <w:tcW w:type="dxa" w:w="2160"/>
+            <w:tcMar>
+              <w:top w:w="80" w:type="dxa"/>
+              <w:start w:w="120" w:type="dxa"/>
+              <w:bottom w:w="80" w:type="dxa"/>
+              <w:end w:w="120" w:type="dxa"/>
+            </w:tcMar>
+            <w:vAlign w:val="center"/>
+          </w:tcPr>
+          <w:p>
+            <w:pPr>
+              <w:spacing w:before="0" w:after="0" w:line="264" w:lineRule="auto"/>
+              <w:jc w:val="left"/>
+            </w:pPr>
+            <w:r>
+              <w:t>4 commits, checkout(1) exact</w:t>
+            </w:r>
+            <w:r>
+              <w:rPr>
+                <w:rFonts w:ascii="Calibri" w:hAnsi="Calibri"/>
+                <w:b w:val="0"/>
+                <w:color w:val="000000"/>
+                <w:sz w:val="18"/>
+              </w:rPr>
+            </w:r>
+          </w:p>
+        </w:tc>
+        <w:tc>
+          <w:tcPr>
+            <w:tcW w:type="dxa" w:w="5150"/>
+            <w:tcMar>
+              <w:top w:w="80" w:type="dxa"/>
+              <w:start w:w="120" w:type="dxa"/>
+              <w:bottom w:w="80" w:type="dxa"/>
+              <w:end w:w="120" w:type="dxa"/>
+            </w:tcMar>
+            <w:vAlign w:val="center"/>
+          </w:tcPr>
+          <w:p>
+            <w:pPr>
+              <w:spacing w:before="0" w:after="0" w:line="264" w:lineRule="auto"/>
+              <w:jc w:val="left"/>
+            </w:pPr>
+            <w:r>
+              <w:t>log() walks HEAD to v1; version 1 state is unchanged</w:t>
+            </w:r>
+            <w:r>
+              <w:rPr>
+                <w:rFonts w:ascii="Calibri" w:hAnsi="Calibri"/>
+                <w:b w:val="0"/>
+                <w:color w:val="000000"/>
+                <w:sz w:val="18"/>
+              </w:rPr>
             </w:r>
           </w:p>
         </w:tc>
@@ -1575,7 +2023,9 @@
               <w:spacing w:before="0" w:after="0" w:line="264" w:lineRule="auto"/>
               <w:jc w:val="right"/>
             </w:pPr>
-            <w:r/>
+            <w:r>
+              <w:t>6.183 ms</w:t>
+            </w:r>
             <w:r>
               <w:rPr>
                 <w:rFonts w:ascii="Calibri" w:hAnsi="Calibri"/>
@@ -1583,7 +2033,6 @@
                 <w:color w:val="000000"/>
                 <w:sz w:val="18"/>
               </w:rPr>
-              <w:t>10.079 ms</w:t>
             </w:r>
           </w:p>
         </w:tc>
@@ -1603,7 +2052,9 @@
               <w:spacing w:before="0" w:after="0" w:line="264" w:lineRule="auto"/>
               <w:jc w:val="right"/>
             </w:pPr>
-            <w:r/>
+            <w:r>
+              <w:t>144.077 ms</w:t>
+            </w:r>
             <w:r>
               <w:rPr>
                 <w:rFonts w:ascii="Calibri" w:hAnsi="Calibri"/>
@@ -1611,7 +2062,6 @@
                 <w:color w:val="000000"/>
                 <w:sz w:val="18"/>
               </w:rPr>
-              <w:t>224.917 ms</w:t>
             </w:r>
           </w:p>
         </w:tc>
@@ -1631,7 +2081,9 @@
               <w:spacing w:before="0" w:after="0" w:line="264" w:lineRule="auto"/>
               <w:jc w:val="right"/>
             </w:pPr>
-            <w:r/>
+            <w:r>
+              <w:t>10.0 MiB</w:t>
+            </w:r>
             <w:r>
               <w:rPr>
                 <w:rFonts w:ascii="Calibri" w:hAnsi="Calibri"/>
@@ -1639,7 +2091,6 @@
                 <w:color w:val="000000"/>
                 <w:sz w:val="18"/>
               </w:rPr>
-              <w:t>10.0 MiB</w:t>
             </w:r>
           </w:p>
         </w:tc>
@@ -1659,7 +2110,9 @@
               <w:spacing w:before="0" w:after="0" w:line="264" w:lineRule="auto"/>
               <w:jc w:val="right"/>
             </w:pPr>
-            <w:r/>
+            <w:r>
+              <w:t>100,000 keys</w:t>
+            </w:r>
             <w:r>
               <w:rPr>
                 <w:rFonts w:ascii="Calibri" w:hAnsi="Calibri"/>
@@ -1667,7 +2120,6 @@
                 <w:color w:val="000000"/>
                 <w:sz w:val="18"/>
               </w:rPr>
-              <w:t>100,000 keys</w:t>
             </w:r>
           </w:p>
         </w:tc>
@@ -1717,7 +2169,9 @@
               <w:spacing w:before="0" w:after="0" w:line="264" w:lineRule="auto"/>
               <w:jc w:val="right"/>
             </w:pPr>
-            <w:r/>
+            <w:r>
+              <w:t>0.001 ms</w:t>
+            </w:r>
             <w:r>
               <w:rPr>
                 <w:rFonts w:ascii="Calibri" w:hAnsi="Calibri"/>
@@ -1725,7 +2179,6 @@
                 <w:color w:val="000000"/>
                 <w:sz w:val="18"/>
               </w:rPr>
-              <w:t>0.002 ms</w:t>
             </w:r>
           </w:p>
         </w:tc>
@@ -1745,7 +2198,9 @@
               <w:spacing w:before="0" w:after="0" w:line="264" w:lineRule="auto"/>
               <w:jc w:val="right"/>
             </w:pPr>
-            <w:r/>
+            <w:r>
+              <w:t>0.020 ms</w:t>
+            </w:r>
             <w:r>
               <w:rPr>
                 <w:rFonts w:ascii="Calibri" w:hAnsi="Calibri"/>
@@ -1753,7 +2208,6 @@
                 <w:color w:val="000000"/>
                 <w:sz w:val="18"/>
               </w:rPr>
-              <w:t>0.061 ms</w:t>
             </w:r>
           </w:p>
         </w:tc>
@@ -1773,7 +2227,9 @@
               <w:spacing w:before="0" w:after="0" w:line="264" w:lineRule="auto"/>
               <w:jc w:val="right"/>
             </w:pPr>
-            <w:r/>
+            <w:r>
+              <w:t>2.0 MiB</w:t>
+            </w:r>
             <w:r>
               <w:rPr>
                 <w:rFonts w:ascii="Calibri" w:hAnsi="Calibri"/>
@@ -1781,7 +2237,6 @@
                 <w:color w:val="000000"/>
                 <w:sz w:val="18"/>
               </w:rPr>
-              <w:t>2.0 MiB</w:t>
             </w:r>
           </w:p>
         </w:tc>
@@ -1801,7 +2256,9 @@
               <w:spacing w:before="0" w:after="0" w:line="264" w:lineRule="auto"/>
               <w:jc w:val="right"/>
             </w:pPr>
-            <w:r/>
+            <w:r>
+              <w:t>40 operations</w:t>
+            </w:r>
             <w:r>
               <w:rPr>
                 <w:rFonts w:ascii="Calibri" w:hAnsi="Calibri"/>
@@ -1809,7 +2266,6 @@
                 <w:color w:val="000000"/>
                 <w:sz w:val="18"/>
               </w:rPr>
-              <w:t>40 operations</w:t>
             </w:r>
           </w:p>
         </w:tc>
@@ -1859,7 +2315,9 @@
               <w:spacing w:before="0" w:after="0" w:line="264" w:lineRule="auto"/>
               <w:jc w:val="right"/>
             </w:pPr>
-            <w:r/>
+            <w:r>
+              <w:t>1.735 ms</w:t>
+            </w:r>
             <w:r>
               <w:rPr>
                 <w:rFonts w:ascii="Calibri" w:hAnsi="Calibri"/>
@@ -1867,7 +2325,6 @@
                 <w:color w:val="000000"/>
                 <w:sz w:val="18"/>
               </w:rPr>
-              <w:t>1,061.734 ms</w:t>
             </w:r>
           </w:p>
         </w:tc>
@@ -1887,7 +2344,9 @@
               <w:spacing w:before="0" w:after="0" w:line="264" w:lineRule="auto"/>
               <w:jc w:val="right"/>
             </w:pPr>
-            <w:r/>
+            <w:r>
+              <w:t>1.754 ms</w:t>
+            </w:r>
             <w:r>
               <w:rPr>
                 <w:rFonts w:ascii="Calibri" w:hAnsi="Calibri"/>
@@ -1895,7 +2354,6 @@
                 <w:color w:val="000000"/>
                 <w:sz w:val="18"/>
               </w:rPr>
-              <w:t>1.118 ms</w:t>
             </w:r>
           </w:p>
         </w:tc>
@@ -1915,7 +2373,9 @@
               <w:spacing w:before="0" w:after="0" w:line="264" w:lineRule="auto"/>
               <w:jc w:val="right"/>
             </w:pPr>
-            <w:r/>
+            <w:r>
+              <w:t>3.0 MiB</w:t>
+            </w:r>
             <w:r>
               <w:rPr>
                 <w:rFonts w:ascii="Calibri" w:hAnsi="Calibri"/>
@@ -1923,7 +2383,6 @@
                 <w:color w:val="000000"/>
                 <w:sz w:val="18"/>
               </w:rPr>
-              <w:t>3.0 MiB</w:t>
             </w:r>
           </w:p>
         </w:tc>
@@ -1943,7 +2402,9 @@
               <w:spacing w:before="0" w:after="0" w:line="264" w:lineRule="auto"/>
               <w:jc w:val="right"/>
             </w:pPr>
-            <w:r/>
+            <w:r>
+              <w:t>601 tree nodes</w:t>
+            </w:r>
             <w:r>
               <w:rPr>
                 <w:rFonts w:ascii="Calibri" w:hAnsi="Calibri"/>
@@ -1951,7 +2412,6 @@
                 <w:color w:val="000000"/>
                 <w:sz w:val="18"/>
               </w:rPr>
-              <w:t>601 tree nodes</w:t>
             </w:r>
           </w:p>
         </w:tc>
@@ -1973,7 +2433,7 @@
           <w:color w:val="666666"/>
           <w:sz w:val="19"/>
         </w:rPr>
-        <w:t xml:space="preserve">Benchmark context: </w:t>
+        <w:t>Benchmark context: 100,000 rows, five versions, and 10 mutations per new version. The Chronos commit figure is now measured on the incremental put() path. Timings are environment-specific prototype measurements and were all taken in a single run on one machine, so the comparison between rows is meaningful while the absolute values are not portable.</w:t>
       </w:r>
       <w:r>
         <w:rPr>
@@ -1982,7 +2442,6 @@
           <w:color w:val="666666"/>
           <w:sz w:val="19"/>
         </w:rPr>
-        <w:t>100,000 rows, five versions, and 10 mutations per new version. Timings are environment-specific prototype measurements.</w:t>
       </w:r>
     </w:p>
     <w:p>
@@ -1990,7 +2449,7 @@
         <w:pStyle w:val="ListBullet"/>
       </w:pPr>
       <w:r>
-        <w:t>Chronos diff was roughly 200 times faster than the full-snapshot scan at 100,000 rows.</w:t>
+        <w:t>Chronos diff was roughly 80 times faster than the full-snapshot scan at 100,000 rows, examining 601 tree nodes instead of 100,000 keys.</w:t>
       </w:r>
     </w:p>
     <w:p>
@@ -2006,7 +2465,7 @@
         <w:pStyle w:val="ListBullet"/>
       </w:pPr>
       <w:r>
-        <w:t>The operation log was fastest for this short history because only 40 operations separated the compared versions.</w:t>
+        <w:t>The operation log remains fastest for this short history because only 40 operations separate the compared versions; its diff cost grows with history length, while the Chronos diff cost does not.</w:t>
       </w:r>
     </w:p>
     <w:p>
@@ -2014,7 +2473,7 @@
         <w:pStyle w:val="ListBullet"/>
       </w:pPr>
       <w:r>
-        <w:t>Chronos commit remains slow because the current prototype rebuilds the candidate tree from the complete state.</w:t>
+        <w:t>Chronos commit is no longer dominated by full-tree rebuilding: the incremental put() path cut the 100,000-row commit from 652 ms to 1.4 ms in a matched run, and it is now faster than copying the full state. A three-key change creates 15 nodes out of 4,681.</w:t>
       </w:r>
     </w:p>
     <w:p>
@@ -2175,7 +2634,9 @@
               <w:spacing w:before="0" w:after="0" w:line="264" w:lineRule="auto"/>
               <w:jc w:val="left"/>
             </w:pPr>
-            <w:r/>
+            <w:r>
+              <w:t>Core hash tree, commit, incremental put/delete, commit graph, checkout, diff, and statistics</w:t>
+            </w:r>
             <w:r>
               <w:rPr>
                 <w:rFonts w:ascii="Calibri" w:hAnsi="Calibri"/>
@@ -2183,7 +2644,6 @@
                 <w:color w:val="000000"/>
                 <w:sz w:val="18"/>
               </w:rPr>
-              <w:t>Core hash tree, commit, diff, versions, and statistics</w:t>
             </w:r>
           </w:p>
         </w:tc>
@@ -2347,7 +2807,9 @@
               <w:spacing w:before="0" w:after="0" w:line="264" w:lineRule="auto"/>
               <w:jc w:val="left"/>
             </w:pPr>
-            <w:r/>
+            <w:r>
+              <w:t>Three-model comparison with four metrics, on the incremental path</w:t>
+            </w:r>
             <w:r>
               <w:rPr>
                 <w:rFonts w:ascii="Calibri" w:hAnsi="Calibri"/>
@@ -2355,7 +2817,6 @@
                 <w:color w:val="000000"/>
                 <w:sz w:val="18"/>
               </w:rPr>
-              <w:t>Three-model comparison with four metrics</w:t>
             </w:r>
           </w:p>
         </w:tc>
@@ -2461,7 +2922,9 @@
               <w:spacing w:before="0" w:after="0" w:line="264" w:lineRule="auto"/>
               <w:jc w:val="left"/>
             </w:pPr>
-            <w:r/>
+            <w:r>
+              <w:t>16 tests passing</w:t>
+            </w:r>
             <w:r>
               <w:rPr>
                 <w:rFonts w:ascii="Calibri" w:hAnsi="Calibri"/>
@@ -2469,7 +2932,6 @@
                 <w:color w:val="000000"/>
                 <w:sz w:val="18"/>
               </w:rPr>
-              <w:t>6 tests passing</w:t>
             </w:r>
           </w:p>
         </w:tc>
@@ -2646,6 +3108,451 @@
           </w:p>
         </w:tc>
       </w:tr>
+      <w:tr>
+        <w:tc>
+          <w:tcPr>
+            <w:tcW w:type="dxa" w:w="2300"/>
+            <w:tcMar>
+              <w:top w:w="80" w:type="dxa"/>
+              <w:start w:w="120" w:type="dxa"/>
+              <w:bottom w:w="80" w:type="dxa"/>
+              <w:end w:w="120" w:type="dxa"/>
+            </w:tcMar>
+            <w:vAlign w:val="center"/>
+          </w:tcPr>
+          <w:p>
+            <w:pPr>
+              <w:spacing w:before="0" w:after="0" w:line="264" w:lineRule="auto"/>
+              <w:jc w:val="left"/>
+            </w:pPr>
+            <w:r>
+              <w:t>incremental_demo.py</w:t>
+            </w:r>
+            <w:r>
+              <w:rPr>
+                <w:rFonts w:ascii="Calibri" w:hAnsi="Calibri"/>
+                <w:b w:val="0"/>
+                <w:color w:val="000000"/>
+                <w:sz w:val="18"/>
+              </w:rPr>
+            </w:r>
+          </w:p>
+        </w:tc>
+        <w:tc>
+          <w:tcPr>
+            <w:tcW w:type="dxa" w:w="4860"/>
+            <w:tcMar>
+              <w:top w:w="80" w:type="dxa"/>
+              <w:start w:w="120" w:type="dxa"/>
+              <w:bottom w:w="80" w:type="dxa"/>
+              <w:end w:w="120" w:type="dxa"/>
+            </w:tcMar>
+            <w:vAlign w:val="center"/>
+          </w:tcPr>
+          <w:p>
+            <w:pPr>
+              <w:spacing w:before="0" w:after="0" w:line="264" w:lineRule="auto"/>
+              <w:jc w:val="left"/>
+            </w:pPr>
+            <w:r>
+              <w:t>Live walkthrough of put(), message-bearing commits, log(), and checkout()</w:t>
+            </w:r>
+            <w:r>
+              <w:rPr>
+                <w:rFonts w:ascii="Calibri" w:hAnsi="Calibri"/>
+                <w:b w:val="0"/>
+                <w:color w:val="000000"/>
+                <w:sz w:val="18"/>
+              </w:rPr>
+            </w:r>
+          </w:p>
+        </w:tc>
+        <w:tc>
+          <w:tcPr>
+            <w:tcW w:type="dxa" w:w="2200"/>
+            <w:tcMar>
+              <w:top w:w="80" w:type="dxa"/>
+              <w:start w:w="120" w:type="dxa"/>
+              <w:bottom w:w="80" w:type="dxa"/>
+              <w:end w:w="120" w:type="dxa"/>
+            </w:tcMar>
+            <w:vAlign w:val="center"/>
+          </w:tcPr>
+          <w:p>
+            <w:pPr>
+              <w:spacing w:before="0" w:after="0" w:line="264" w:lineRule="auto"/>
+              <w:jc w:val="left"/>
+            </w:pPr>
+            <w:r>
+              <w:t>Runs successfully</w:t>
+            </w:r>
+            <w:r>
+              <w:rPr>
+                <w:rFonts w:ascii="Calibri" w:hAnsi="Calibri"/>
+                <w:b w:val="0"/>
+                <w:color w:val="000000"/>
+                <w:sz w:val="18"/>
+              </w:rPr>
+            </w:r>
+          </w:p>
+        </w:tc>
+      </w:tr>
+      <w:tr>
+        <w:tc>
+          <w:tcPr>
+            <w:tcW w:type="dxa" w:w="2300"/>
+            <w:tcMar>
+              <w:top w:w="80" w:type="dxa"/>
+              <w:start w:w="120" w:type="dxa"/>
+              <w:bottom w:w="80" w:type="dxa"/>
+              <w:end w:w="120" w:type="dxa"/>
+            </w:tcMar>
+            <w:vAlign w:val="center"/>
+          </w:tcPr>
+          <w:p>
+            <w:pPr>
+              <w:spacing w:before="0" w:after="0" w:line="264" w:lineRule="auto"/>
+              <w:jc w:val="left"/>
+            </w:pPr>
+            <w:r>
+              <w:t>incremental_benchmark.py</w:t>
+            </w:r>
+            <w:r>
+              <w:rPr>
+                <w:rFonts w:ascii="Calibri" w:hAnsi="Calibri"/>
+                <w:b w:val="0"/>
+                <w:color w:val="000000"/>
+                <w:sz w:val="18"/>
+              </w:rPr>
+            </w:r>
+          </w:p>
+        </w:tc>
+        <w:tc>
+          <w:tcPr>
+            <w:tcW w:type="dxa" w:w="4860"/>
+            <w:tcMar>
+              <w:top w:w="80" w:type="dxa"/>
+              <w:start w:w="120" w:type="dxa"/>
+              <w:bottom w:w="80" w:type="dxa"/>
+              <w:end w:w="120" w:type="dxa"/>
+            </w:tcMar>
+            <w:vAlign w:val="center"/>
+          </w:tcPr>
+          <w:p>
+            <w:pPr>
+              <w:spacing w:before="0" w:after="0" w:line="264" w:lineRule="auto"/>
+              <w:jc w:val="left"/>
+            </w:pPr>
+            <w:r>
+              <w:t>Incremental path versus the old full-rebuild path, at three scales</w:t>
+            </w:r>
+            <w:r>
+              <w:rPr>
+                <w:rFonts w:ascii="Calibri" w:hAnsi="Calibri"/>
+                <w:b w:val="0"/>
+                <w:color w:val="000000"/>
+                <w:sz w:val="18"/>
+              </w:rPr>
+            </w:r>
+          </w:p>
+        </w:tc>
+        <w:tc>
+          <w:tcPr>
+            <w:tcW w:type="dxa" w:w="2200"/>
+            <w:tcMar>
+              <w:top w:w="80" w:type="dxa"/>
+              <w:start w:w="120" w:type="dxa"/>
+              <w:bottom w:w="80" w:type="dxa"/>
+              <w:end w:w="120" w:type="dxa"/>
+            </w:tcMar>
+            <w:vAlign w:val="center"/>
+          </w:tcPr>
+          <w:p>
+            <w:pPr>
+              <w:spacing w:before="0" w:after="0" w:line="264" w:lineRule="auto"/>
+              <w:jc w:val="left"/>
+            </w:pPr>
+            <w:r>
+              <w:t>Runs successfully</w:t>
+            </w:r>
+            <w:r>
+              <w:rPr>
+                <w:rFonts w:ascii="Calibri" w:hAnsi="Calibri"/>
+                <w:b w:val="0"/>
+                <w:color w:val="000000"/>
+                <w:sz w:val="18"/>
+              </w:rPr>
+            </w:r>
+          </w:p>
+        </w:tc>
+      </w:tr>
+      <w:tr>
+        <w:tc>
+          <w:tcPr>
+            <w:tcW w:type="dxa" w:w="2300"/>
+            <w:tcMar>
+              <w:top w:w="80" w:type="dxa"/>
+              <w:start w:w="120" w:type="dxa"/>
+              <w:bottom w:w="80" w:type="dxa"/>
+              <w:end w:w="120" w:type="dxa"/>
+            </w:tcMar>
+            <w:vAlign w:val="center"/>
+          </w:tcPr>
+          <w:p>
+            <w:pPr>
+              <w:spacing w:before="0" w:after="0" w:line="264" w:lineRule="auto"/>
+              <w:jc w:val="left"/>
+            </w:pPr>
+            <w:r>
+              <w:t>test_csv_snapshot_demo.py</w:t>
+            </w:r>
+            <w:r>
+              <w:rPr>
+                <w:rFonts w:ascii="Calibri" w:hAnsi="Calibri"/>
+                <w:b w:val="0"/>
+                <w:color w:val="000000"/>
+                <w:sz w:val="18"/>
+              </w:rPr>
+            </w:r>
+          </w:p>
+        </w:tc>
+        <w:tc>
+          <w:tcPr>
+            <w:tcW w:type="dxa" w:w="4860"/>
+            <w:tcMar>
+              <w:top w:w="80" w:type="dxa"/>
+              <w:start w:w="120" w:type="dxa"/>
+              <w:bottom w:w="80" w:type="dxa"/>
+              <w:end w:w="120" w:type="dxa"/>
+            </w:tcMar>
+            <w:vAlign w:val="center"/>
+          </w:tcPr>
+          <w:p>
+            <w:pPr>
+              <w:spacing w:before="0" w:after="0" w:line="264" w:lineRule="auto"/>
+              <w:jc w:val="left"/>
+            </w:pPr>
+            <w:r>
+              <w:t>CSV loading, commit metadata, and diff tests</w:t>
+            </w:r>
+            <w:r>
+              <w:rPr>
+                <w:rFonts w:ascii="Calibri" w:hAnsi="Calibri"/>
+                <w:b w:val="0"/>
+                <w:color w:val="000000"/>
+                <w:sz w:val="18"/>
+              </w:rPr>
+            </w:r>
+          </w:p>
+        </w:tc>
+        <w:tc>
+          <w:tcPr>
+            <w:tcW w:type="dxa" w:w="2200"/>
+            <w:tcMar>
+              <w:top w:w="80" w:type="dxa"/>
+              <w:start w:w="120" w:type="dxa"/>
+              <w:bottom w:w="80" w:type="dxa"/>
+              <w:end w:w="120" w:type="dxa"/>
+            </w:tcMar>
+            <w:vAlign w:val="center"/>
+          </w:tcPr>
+          <w:p>
+            <w:pPr>
+              <w:spacing w:before="0" w:after="0" w:line="264" w:lineRule="auto"/>
+              <w:jc w:val="left"/>
+            </w:pPr>
+            <w:r>
+              <w:t>3 tests passing</w:t>
+            </w:r>
+            <w:r>
+              <w:rPr>
+                <w:rFonts w:ascii="Calibri" w:hAnsi="Calibri"/>
+                <w:b w:val="0"/>
+                <w:color w:val="000000"/>
+                <w:sz w:val="18"/>
+              </w:rPr>
+            </w:r>
+          </w:p>
+        </w:tc>
+      </w:tr>
+      <w:tr>
+        <w:tc>
+          <w:tcPr>
+            <w:tcW w:type="dxa" w:w="2300"/>
+            <w:tcMar>
+              <w:top w:w="80" w:type="dxa"/>
+              <w:start w:w="120" w:type="dxa"/>
+              <w:bottom w:w="80" w:type="dxa"/>
+              <w:end w:w="120" w:type="dxa"/>
+            </w:tcMar>
+            <w:vAlign w:val="center"/>
+          </w:tcPr>
+          <w:p>
+            <w:pPr>
+              <w:spacing w:before="0" w:after="0" w:line="264" w:lineRule="auto"/>
+              <w:jc w:val="left"/>
+            </w:pPr>
+            <w:r>
+              <w:t>BENCHMARK_RESULTS_POST_INCREMENTAL.md</w:t>
+            </w:r>
+            <w:r>
+              <w:rPr>
+                <w:rFonts w:ascii="Calibri" w:hAnsi="Calibri"/>
+                <w:b w:val="0"/>
+                <w:color w:val="000000"/>
+                <w:sz w:val="18"/>
+              </w:rPr>
+            </w:r>
+          </w:p>
+        </w:tc>
+        <w:tc>
+          <w:tcPr>
+            <w:tcW w:type="dxa" w:w="4860"/>
+            <w:tcMar>
+              <w:top w:w="80" w:type="dxa"/>
+              <w:start w:w="120" w:type="dxa"/>
+              <w:bottom w:w="80" w:type="dxa"/>
+              <w:end w:w="120" w:type="dxa"/>
+            </w:tcMar>
+            <w:vAlign w:val="center"/>
+          </w:tcPr>
+          <w:p>
+            <w:pPr>
+              <w:spacing w:before="0" w:after="0" w:line="264" w:lineRule="auto"/>
+              <w:jc w:val="left"/>
+            </w:pPr>
+            <w:r>
+              <w:t>Recorded before/after commit timings and diff sanity checks</w:t>
+            </w:r>
+            <w:r>
+              <w:rPr>
+                <w:rFonts w:ascii="Calibri" w:hAnsi="Calibri"/>
+                <w:b w:val="0"/>
+                <w:color w:val="000000"/>
+                <w:sz w:val="18"/>
+              </w:rPr>
+            </w:r>
+          </w:p>
+        </w:tc>
+        <w:tc>
+          <w:tcPr>
+            <w:tcW w:type="dxa" w:w="2200"/>
+            <w:tcMar>
+              <w:top w:w="80" w:type="dxa"/>
+              <w:start w:w="120" w:type="dxa"/>
+              <w:bottom w:w="80" w:type="dxa"/>
+              <w:end w:w="120" w:type="dxa"/>
+            </w:tcMar>
+            <w:vAlign w:val="center"/>
+          </w:tcPr>
+          <w:p>
+            <w:pPr>
+              <w:spacing w:before="0" w:after="0" w:line="264" w:lineRule="auto"/>
+              <w:jc w:val="left"/>
+            </w:pPr>
+            <w:r>
+              <w:t>Current</w:t>
+            </w:r>
+            <w:r>
+              <w:rPr>
+                <w:rFonts w:ascii="Calibri" w:hAnsi="Calibri"/>
+                <w:b w:val="0"/>
+                <w:color w:val="000000"/>
+                <w:sz w:val="18"/>
+              </w:rPr>
+            </w:r>
+          </w:p>
+        </w:tc>
+      </w:tr>
+      <w:tr>
+        <w:tc>
+          <w:tcPr>
+            <w:tcW w:type="dxa" w:w="2300"/>
+            <w:tcMar>
+              <w:top w:w="80" w:type="dxa"/>
+              <w:start w:w="120" w:type="dxa"/>
+              <w:bottom w:w="80" w:type="dxa"/>
+              <w:end w:w="120" w:type="dxa"/>
+            </w:tcMar>
+            <w:vAlign w:val="center"/>
+          </w:tcPr>
+          <w:p>
+            <w:pPr>
+              <w:spacing w:before="0" w:after="0" w:line="264" w:lineRule="auto"/>
+              <w:jc w:val="left"/>
+            </w:pPr>
+            <w:r>
+              <w:t>PLANS.md</w:t>
+            </w:r>
+            <w:r>
+              <w:rPr>
+                <w:rFonts w:ascii="Calibri" w:hAnsi="Calibri"/>
+                <w:b w:val="0"/>
+                <w:color w:val="000000"/>
+                <w:sz w:val="18"/>
+              </w:rPr>
+            </w:r>
+          </w:p>
+        </w:tc>
+        <w:tc>
+          <w:tcPr>
+            <w:tcW w:type="dxa" w:w="4860"/>
+            <w:tcMar>
+              <w:top w:w="80" w:type="dxa"/>
+              <w:start w:w="120" w:type="dxa"/>
+              <w:bottom w:w="80" w:type="dxa"/>
+              <w:end w:w="120" w:type="dxa"/>
+            </w:tcMar>
+            <w:vAlign w:val="center"/>
+          </w:tcPr>
+          <w:p>
+            <w:pPr>
+              <w:spacing w:before="0" w:after="0" w:line="264" w:lineRule="auto"/>
+              <w:jc w:val="left"/>
+            </w:pPr>
+            <w:r>
+              <w:t>Roadmap and candidate research directions beyond this review</w:t>
+            </w:r>
+            <w:r>
+              <w:rPr>
+                <w:rFonts w:ascii="Calibri" w:hAnsi="Calibri"/>
+                <w:b w:val="0"/>
+                <w:color w:val="000000"/>
+                <w:sz w:val="18"/>
+              </w:rPr>
+            </w:r>
+          </w:p>
+        </w:tc>
+        <w:tc>
+          <w:tcPr>
+            <w:tcW w:type="dxa" w:w="2200"/>
+            <w:tcMar>
+              <w:top w:w="80" w:type="dxa"/>
+              <w:start w:w="120" w:type="dxa"/>
+              <w:bottom w:w="80" w:type="dxa"/>
+              <w:end w:w="120" w:type="dxa"/>
+            </w:tcMar>
+            <w:vAlign w:val="center"/>
+          </w:tcPr>
+          <w:p>
+            <w:pPr>
+              <w:spacing w:before="0" w:after="0" w:line="264" w:lineRule="auto"/>
+              <w:jc w:val="left"/>
+            </w:pPr>
+            <w:r>
+              <w:t>Current</w:t>
+            </w:r>
+            <w:r>
+              <w:rPr>
+                <w:rFonts w:ascii="Calibri" w:hAnsi="Calibri"/>
+                <w:b w:val="0"/>
+                <w:color w:val="000000"/>
+                <w:sz w:val="18"/>
+              </w:rPr>
+            </w:r>
+          </w:p>
+        </w:tc>
+      </w:tr>
     </w:tbl>
     <w:p>
       <w:pPr>
@@ -2665,7 +3572,7 @@
           <w:color w:val="1F4D78"/>
           <w:sz w:val="22"/>
         </w:rPr>
-        <w:t xml:space="preserve">Scope boundary: </w:t>
+        <w:t>Scope boundary: The completed system is an in-memory proof of concept. It provides incremental writes, a commit graph, and checkout, but does not yet provide durable storage, crash recovery, transactions, branching, or merging.</w:t>
       </w:r>
       <w:r>
         <w:rPr>
@@ -2673,7 +3580,6 @@
           <w:color w:val="000000"/>
           <w:sz w:val="22"/>
         </w:rPr>
-        <w:t>The completed system is an in-memory proof of concept. It does not yet provide durable storage, crash recovery, transactions, checkout, branching, or merging.</w:t>
       </w:r>
     </w:p>
     <w:sectPr>

</xml_diff>